<commit_message>
feat: implement meeting management module with domain ports, application handlers, and REST controllers for CRUD, audio processing, and transcripts.
</commit_message>
<xml_diff>
--- a/Document/MP2_Danh_sach_API.docx
+++ b/Document/MP2_Danh_sach_API.docx
@@ -61,12 +61,6 @@
         <w:gridCol w:w="2479"/>
       </w:tblGrid>
       <w:tr>
-        <w:tblPrEx>
-          <w:tblCellMar>
-            <w:top w:w="0" w:type="dxa"/>
-            <w:bottom w:w="0" w:type="dxa"/>
-          </w:tblCellMar>
-        </w:tblPrEx>
         <w:trPr>
           <w:trHeight w:val="204"/>
           <w:tblHeader/>
@@ -253,12 +247,6 @@
         </w:tc>
       </w:tr>
       <w:tr>
-        <w:tblPrEx>
-          <w:tblCellMar>
-            <w:top w:w="0" w:type="dxa"/>
-            <w:bottom w:w="0" w:type="dxa"/>
-          </w:tblCellMar>
-        </w:tblPrEx>
         <w:trPr>
           <w:trHeight w:val="627"/>
         </w:trPr>
@@ -271,6 +259,7 @@
               <w:bottom w:val="single" w:sz="1" w:space="0" w:color="AAAAAA"/>
               <w:right w:val="single" w:sz="1" w:space="0" w:color="AAAAAA"/>
             </w:tcBorders>
+            <w:shd w:val="clear" w:color="auto" w:fill="70AD47" w:themeFill="accent6"/>
             <w:tcMar>
               <w:top w:w="80" w:type="dxa"/>
               <w:left w:w="120" w:type="dxa"/>
@@ -298,6 +287,7 @@
               <w:bottom w:val="single" w:sz="1" w:space="0" w:color="AAAAAA"/>
               <w:right w:val="single" w:sz="1" w:space="0" w:color="AAAAAA"/>
             </w:tcBorders>
+            <w:shd w:val="clear" w:color="auto" w:fill="70AD47" w:themeFill="accent6"/>
             <w:tcMar>
               <w:top w:w="80" w:type="dxa"/>
               <w:left w:w="120" w:type="dxa"/>
@@ -325,6 +315,7 @@
               <w:bottom w:val="single" w:sz="1" w:space="0" w:color="AAAAAA"/>
               <w:right w:val="single" w:sz="1" w:space="0" w:color="AAAAAA"/>
             </w:tcBorders>
+            <w:shd w:val="clear" w:color="auto" w:fill="70AD47" w:themeFill="accent6"/>
             <w:tcMar>
               <w:top w:w="80" w:type="dxa"/>
               <w:left w:w="120" w:type="dxa"/>
@@ -352,6 +343,7 @@
               <w:bottom w:val="single" w:sz="1" w:space="0" w:color="AAAAAA"/>
               <w:right w:val="single" w:sz="1" w:space="0" w:color="AAAAAA"/>
             </w:tcBorders>
+            <w:shd w:val="clear" w:color="auto" w:fill="70AD47" w:themeFill="accent6"/>
             <w:tcMar>
               <w:top w:w="80" w:type="dxa"/>
               <w:left w:w="120" w:type="dxa"/>
@@ -379,6 +371,7 @@
               <w:bottom w:val="single" w:sz="1" w:space="0" w:color="AAAAAA"/>
               <w:right w:val="single" w:sz="1" w:space="0" w:color="AAAAAA"/>
             </w:tcBorders>
+            <w:shd w:val="clear" w:color="auto" w:fill="70AD47" w:themeFill="accent6"/>
             <w:tcMar>
               <w:top w:w="80" w:type="dxa"/>
               <w:left w:w="120" w:type="dxa"/>
@@ -406,6 +399,7 @@
               <w:bottom w:val="single" w:sz="1" w:space="0" w:color="AAAAAA"/>
               <w:right w:val="single" w:sz="1" w:space="0" w:color="AAAAAA"/>
             </w:tcBorders>
+            <w:shd w:val="clear" w:color="auto" w:fill="70AD47" w:themeFill="accent6"/>
             <w:tcMar>
               <w:top w:w="80" w:type="dxa"/>
               <w:left w:w="120" w:type="dxa"/>
@@ -426,12 +420,6 @@
         </w:tc>
       </w:tr>
       <w:tr>
-        <w:tblPrEx>
-          <w:tblCellMar>
-            <w:top w:w="0" w:type="dxa"/>
-            <w:bottom w:w="0" w:type="dxa"/>
-          </w:tblCellMar>
-        </w:tblPrEx>
         <w:trPr>
           <w:trHeight w:val="627"/>
         </w:trPr>
@@ -444,6 +432,7 @@
               <w:bottom w:val="single" w:sz="1" w:space="0" w:color="AAAAAA"/>
               <w:right w:val="single" w:sz="1" w:space="0" w:color="AAAAAA"/>
             </w:tcBorders>
+            <w:shd w:val="clear" w:color="auto" w:fill="70AD47" w:themeFill="accent6"/>
             <w:tcMar>
               <w:top w:w="80" w:type="dxa"/>
               <w:left w:w="120" w:type="dxa"/>
@@ -471,6 +460,7 @@
               <w:bottom w:val="single" w:sz="1" w:space="0" w:color="AAAAAA"/>
               <w:right w:val="single" w:sz="1" w:space="0" w:color="AAAAAA"/>
             </w:tcBorders>
+            <w:shd w:val="clear" w:color="auto" w:fill="70AD47" w:themeFill="accent6"/>
             <w:tcMar>
               <w:top w:w="80" w:type="dxa"/>
               <w:left w:w="120" w:type="dxa"/>
@@ -498,6 +488,7 @@
               <w:bottom w:val="single" w:sz="1" w:space="0" w:color="AAAAAA"/>
               <w:right w:val="single" w:sz="1" w:space="0" w:color="AAAAAA"/>
             </w:tcBorders>
+            <w:shd w:val="clear" w:color="auto" w:fill="70AD47" w:themeFill="accent6"/>
             <w:tcMar>
               <w:top w:w="80" w:type="dxa"/>
               <w:left w:w="120" w:type="dxa"/>
@@ -525,6 +516,7 @@
               <w:bottom w:val="single" w:sz="1" w:space="0" w:color="AAAAAA"/>
               <w:right w:val="single" w:sz="1" w:space="0" w:color="AAAAAA"/>
             </w:tcBorders>
+            <w:shd w:val="clear" w:color="auto" w:fill="70AD47" w:themeFill="accent6"/>
             <w:tcMar>
               <w:top w:w="80" w:type="dxa"/>
               <w:left w:w="120" w:type="dxa"/>
@@ -552,6 +544,7 @@
               <w:bottom w:val="single" w:sz="1" w:space="0" w:color="AAAAAA"/>
               <w:right w:val="single" w:sz="1" w:space="0" w:color="AAAAAA"/>
             </w:tcBorders>
+            <w:shd w:val="clear" w:color="auto" w:fill="70AD47" w:themeFill="accent6"/>
             <w:tcMar>
               <w:top w:w="80" w:type="dxa"/>
               <w:left w:w="120" w:type="dxa"/>
@@ -579,6 +572,7 @@
               <w:bottom w:val="single" w:sz="1" w:space="0" w:color="AAAAAA"/>
               <w:right w:val="single" w:sz="1" w:space="0" w:color="AAAAAA"/>
             </w:tcBorders>
+            <w:shd w:val="clear" w:color="auto" w:fill="70AD47" w:themeFill="accent6"/>
             <w:tcMar>
               <w:top w:w="80" w:type="dxa"/>
               <w:left w:w="120" w:type="dxa"/>
@@ -599,12 +593,6 @@
         </w:tc>
       </w:tr>
       <w:tr>
-        <w:tblPrEx>
-          <w:tblCellMar>
-            <w:top w:w="0" w:type="dxa"/>
-            <w:bottom w:w="0" w:type="dxa"/>
-          </w:tblCellMar>
-        </w:tblPrEx>
         <w:trPr>
           <w:trHeight w:val="415"/>
         </w:trPr>
@@ -617,6 +605,7 @@
               <w:bottom w:val="single" w:sz="1" w:space="0" w:color="AAAAAA"/>
               <w:right w:val="single" w:sz="1" w:space="0" w:color="AAAAAA"/>
             </w:tcBorders>
+            <w:shd w:val="clear" w:color="auto" w:fill="70AD47" w:themeFill="accent6"/>
             <w:tcMar>
               <w:top w:w="80" w:type="dxa"/>
               <w:left w:w="120" w:type="dxa"/>
@@ -644,6 +633,7 @@
               <w:bottom w:val="single" w:sz="1" w:space="0" w:color="AAAAAA"/>
               <w:right w:val="single" w:sz="1" w:space="0" w:color="AAAAAA"/>
             </w:tcBorders>
+            <w:shd w:val="clear" w:color="auto" w:fill="70AD47" w:themeFill="accent6"/>
             <w:tcMar>
               <w:top w:w="80" w:type="dxa"/>
               <w:left w:w="120" w:type="dxa"/>
@@ -671,6 +661,7 @@
               <w:bottom w:val="single" w:sz="1" w:space="0" w:color="AAAAAA"/>
               <w:right w:val="single" w:sz="1" w:space="0" w:color="AAAAAA"/>
             </w:tcBorders>
+            <w:shd w:val="clear" w:color="auto" w:fill="70AD47" w:themeFill="accent6"/>
             <w:tcMar>
               <w:top w:w="80" w:type="dxa"/>
               <w:left w:w="120" w:type="dxa"/>
@@ -698,6 +689,7 @@
               <w:bottom w:val="single" w:sz="1" w:space="0" w:color="AAAAAA"/>
               <w:right w:val="single" w:sz="1" w:space="0" w:color="AAAAAA"/>
             </w:tcBorders>
+            <w:shd w:val="clear" w:color="auto" w:fill="70AD47" w:themeFill="accent6"/>
             <w:tcMar>
               <w:top w:w="80" w:type="dxa"/>
               <w:left w:w="120" w:type="dxa"/>
@@ -725,6 +717,7 @@
               <w:bottom w:val="single" w:sz="1" w:space="0" w:color="AAAAAA"/>
               <w:right w:val="single" w:sz="1" w:space="0" w:color="AAAAAA"/>
             </w:tcBorders>
+            <w:shd w:val="clear" w:color="auto" w:fill="70AD47" w:themeFill="accent6"/>
             <w:tcMar>
               <w:top w:w="80" w:type="dxa"/>
               <w:left w:w="120" w:type="dxa"/>
@@ -752,6 +745,7 @@
               <w:bottom w:val="single" w:sz="1" w:space="0" w:color="AAAAAA"/>
               <w:right w:val="single" w:sz="1" w:space="0" w:color="AAAAAA"/>
             </w:tcBorders>
+            <w:shd w:val="clear" w:color="auto" w:fill="70AD47" w:themeFill="accent6"/>
             <w:tcMar>
               <w:top w:w="80" w:type="dxa"/>
               <w:left w:w="120" w:type="dxa"/>
@@ -772,12 +766,6 @@
         </w:tc>
       </w:tr>
       <w:tr>
-        <w:tblPrEx>
-          <w:tblCellMar>
-            <w:top w:w="0" w:type="dxa"/>
-            <w:bottom w:w="0" w:type="dxa"/>
-          </w:tblCellMar>
-        </w:tblPrEx>
         <w:trPr>
           <w:trHeight w:val="424"/>
         </w:trPr>
@@ -790,6 +778,7 @@
               <w:bottom w:val="single" w:sz="1" w:space="0" w:color="AAAAAA"/>
               <w:right w:val="single" w:sz="1" w:space="0" w:color="AAAAAA"/>
             </w:tcBorders>
+            <w:shd w:val="clear" w:color="auto" w:fill="70AD47" w:themeFill="accent6"/>
             <w:tcMar>
               <w:top w:w="80" w:type="dxa"/>
               <w:left w:w="120" w:type="dxa"/>
@@ -817,6 +806,7 @@
               <w:bottom w:val="single" w:sz="1" w:space="0" w:color="AAAAAA"/>
               <w:right w:val="single" w:sz="1" w:space="0" w:color="AAAAAA"/>
             </w:tcBorders>
+            <w:shd w:val="clear" w:color="auto" w:fill="70AD47" w:themeFill="accent6"/>
             <w:tcMar>
               <w:top w:w="80" w:type="dxa"/>
               <w:left w:w="120" w:type="dxa"/>
@@ -844,22 +834,33 @@
               <w:bottom w:val="single" w:sz="1" w:space="0" w:color="AAAAAA"/>
               <w:right w:val="single" w:sz="1" w:space="0" w:color="AAAAAA"/>
             </w:tcBorders>
-            <w:tcMar>
-              <w:top w:w="80" w:type="dxa"/>
-              <w:left w:w="120" w:type="dxa"/>
-              <w:bottom w:w="80" w:type="dxa"/>
-              <w:right w:w="120" w:type="dxa"/>
-            </w:tcMar>
-          </w:tcPr>
-          <w:p>
-            <w:r>
-              <w:rPr>
-                <w:color w:val="000000"/>
-                <w:sz w:val="19"/>
-                <w:szCs w:val="19"/>
-              </w:rPr>
-              <w:t>POST /auth/forgot-password</w:t>
-            </w:r>
+            <w:shd w:val="clear" w:color="auto" w:fill="70AD47" w:themeFill="accent6"/>
+            <w:tcMar>
+              <w:top w:w="80" w:type="dxa"/>
+              <w:left w:w="120" w:type="dxa"/>
+              <w:bottom w:w="80" w:type="dxa"/>
+              <w:right w:w="120" w:type="dxa"/>
+            </w:tcMar>
+          </w:tcPr>
+          <w:p>
+            <w:r>
+              <w:rPr>
+                <w:color w:val="000000"/>
+                <w:sz w:val="19"/>
+                <w:szCs w:val="19"/>
+              </w:rPr>
+              <w:t>POST /auth/</w:t>
+            </w:r>
+            <w:proofErr w:type="gramStart"/>
+            <w:r>
+              <w:rPr>
+                <w:color w:val="000000"/>
+                <w:sz w:val="19"/>
+                <w:szCs w:val="19"/>
+              </w:rPr>
+              <w:t>forgot-password</w:t>
+            </w:r>
+            <w:proofErr w:type="gramEnd"/>
           </w:p>
         </w:tc>
         <w:tc>
@@ -871,6 +872,7 @@
               <w:bottom w:val="single" w:sz="1" w:space="0" w:color="AAAAAA"/>
               <w:right w:val="single" w:sz="1" w:space="0" w:color="AAAAAA"/>
             </w:tcBorders>
+            <w:shd w:val="clear" w:color="auto" w:fill="70AD47" w:themeFill="accent6"/>
             <w:tcMar>
               <w:top w:w="80" w:type="dxa"/>
               <w:left w:w="120" w:type="dxa"/>
@@ -898,6 +900,7 @@
               <w:bottom w:val="single" w:sz="1" w:space="0" w:color="AAAAAA"/>
               <w:right w:val="single" w:sz="1" w:space="0" w:color="AAAAAA"/>
             </w:tcBorders>
+            <w:shd w:val="clear" w:color="auto" w:fill="70AD47" w:themeFill="accent6"/>
             <w:tcMar>
               <w:top w:w="80" w:type="dxa"/>
               <w:left w:w="120" w:type="dxa"/>
@@ -925,6 +928,7 @@
               <w:bottom w:val="single" w:sz="1" w:space="0" w:color="AAAAAA"/>
               <w:right w:val="single" w:sz="1" w:space="0" w:color="AAAAAA"/>
             </w:tcBorders>
+            <w:shd w:val="clear" w:color="auto" w:fill="70AD47" w:themeFill="accent6"/>
             <w:tcMar>
               <w:top w:w="80" w:type="dxa"/>
               <w:left w:w="120" w:type="dxa"/>
@@ -945,12 +949,6 @@
         </w:tc>
       </w:tr>
       <w:tr>
-        <w:tblPrEx>
-          <w:tblCellMar>
-            <w:top w:w="0" w:type="dxa"/>
-            <w:bottom w:w="0" w:type="dxa"/>
-          </w:tblCellMar>
-        </w:tblPrEx>
         <w:trPr>
           <w:trHeight w:val="415"/>
         </w:trPr>
@@ -963,6 +961,7 @@
               <w:bottom w:val="single" w:sz="1" w:space="0" w:color="AAAAAA"/>
               <w:right w:val="single" w:sz="1" w:space="0" w:color="AAAAAA"/>
             </w:tcBorders>
+            <w:shd w:val="clear" w:color="auto" w:fill="70AD47" w:themeFill="accent6"/>
             <w:tcMar>
               <w:top w:w="80" w:type="dxa"/>
               <w:left w:w="120" w:type="dxa"/>
@@ -990,6 +989,7 @@
               <w:bottom w:val="single" w:sz="1" w:space="0" w:color="AAAAAA"/>
               <w:right w:val="single" w:sz="1" w:space="0" w:color="AAAAAA"/>
             </w:tcBorders>
+            <w:shd w:val="clear" w:color="auto" w:fill="70AD47" w:themeFill="accent6"/>
             <w:tcMar>
               <w:top w:w="80" w:type="dxa"/>
               <w:left w:w="120" w:type="dxa"/>
@@ -1017,6 +1017,7 @@
               <w:bottom w:val="single" w:sz="1" w:space="0" w:color="AAAAAA"/>
               <w:right w:val="single" w:sz="1" w:space="0" w:color="AAAAAA"/>
             </w:tcBorders>
+            <w:shd w:val="clear" w:color="auto" w:fill="70AD47" w:themeFill="accent6"/>
             <w:tcMar>
               <w:top w:w="80" w:type="dxa"/>
               <w:left w:w="120" w:type="dxa"/>
@@ -1044,6 +1045,7 @@
               <w:bottom w:val="single" w:sz="1" w:space="0" w:color="AAAAAA"/>
               <w:right w:val="single" w:sz="1" w:space="0" w:color="AAAAAA"/>
             </w:tcBorders>
+            <w:shd w:val="clear" w:color="auto" w:fill="70AD47" w:themeFill="accent6"/>
             <w:tcMar>
               <w:top w:w="80" w:type="dxa"/>
               <w:left w:w="120" w:type="dxa"/>
@@ -1071,6 +1073,7 @@
               <w:bottom w:val="single" w:sz="1" w:space="0" w:color="AAAAAA"/>
               <w:right w:val="single" w:sz="1" w:space="0" w:color="AAAAAA"/>
             </w:tcBorders>
+            <w:shd w:val="clear" w:color="auto" w:fill="70AD47" w:themeFill="accent6"/>
             <w:tcMar>
               <w:top w:w="80" w:type="dxa"/>
               <w:left w:w="120" w:type="dxa"/>
@@ -1098,6 +1101,7 @@
               <w:bottom w:val="single" w:sz="1" w:space="0" w:color="AAAAAA"/>
               <w:right w:val="single" w:sz="1" w:space="0" w:color="AAAAAA"/>
             </w:tcBorders>
+            <w:shd w:val="clear" w:color="auto" w:fill="70AD47" w:themeFill="accent6"/>
             <w:tcMar>
               <w:top w:w="80" w:type="dxa"/>
               <w:left w:w="120" w:type="dxa"/>
@@ -1118,12 +1122,6 @@
         </w:tc>
       </w:tr>
       <w:tr>
-        <w:tblPrEx>
-          <w:tblCellMar>
-            <w:top w:w="0" w:type="dxa"/>
-            <w:bottom w:w="0" w:type="dxa"/>
-          </w:tblCellMar>
-        </w:tblPrEx>
         <w:trPr>
           <w:trHeight w:val="415"/>
         </w:trPr>
@@ -1136,6 +1134,7 @@
               <w:bottom w:val="single" w:sz="1" w:space="0" w:color="AAAAAA"/>
               <w:right w:val="single" w:sz="1" w:space="0" w:color="AAAAAA"/>
             </w:tcBorders>
+            <w:shd w:val="clear" w:color="auto" w:fill="70AD47" w:themeFill="accent6"/>
             <w:tcMar>
               <w:top w:w="80" w:type="dxa"/>
               <w:left w:w="120" w:type="dxa"/>
@@ -1163,6 +1162,7 @@
               <w:bottom w:val="single" w:sz="1" w:space="0" w:color="AAAAAA"/>
               <w:right w:val="single" w:sz="1" w:space="0" w:color="AAAAAA"/>
             </w:tcBorders>
+            <w:shd w:val="clear" w:color="auto" w:fill="70AD47" w:themeFill="accent6"/>
             <w:tcMar>
               <w:top w:w="80" w:type="dxa"/>
               <w:left w:w="120" w:type="dxa"/>
@@ -1190,6 +1190,7 @@
               <w:bottom w:val="single" w:sz="1" w:space="0" w:color="AAAAAA"/>
               <w:right w:val="single" w:sz="1" w:space="0" w:color="AAAAAA"/>
             </w:tcBorders>
+            <w:shd w:val="clear" w:color="auto" w:fill="70AD47" w:themeFill="accent6"/>
             <w:tcMar>
               <w:top w:w="80" w:type="dxa"/>
               <w:left w:w="120" w:type="dxa"/>
@@ -1217,6 +1218,7 @@
               <w:bottom w:val="single" w:sz="1" w:space="0" w:color="AAAAAA"/>
               <w:right w:val="single" w:sz="1" w:space="0" w:color="AAAAAA"/>
             </w:tcBorders>
+            <w:shd w:val="clear" w:color="auto" w:fill="70AD47" w:themeFill="accent6"/>
             <w:tcMar>
               <w:top w:w="80" w:type="dxa"/>
               <w:left w:w="120" w:type="dxa"/>
@@ -1244,6 +1246,7 @@
               <w:bottom w:val="single" w:sz="1" w:space="0" w:color="AAAAAA"/>
               <w:right w:val="single" w:sz="1" w:space="0" w:color="AAAAAA"/>
             </w:tcBorders>
+            <w:shd w:val="clear" w:color="auto" w:fill="70AD47" w:themeFill="accent6"/>
             <w:tcMar>
               <w:top w:w="80" w:type="dxa"/>
               <w:left w:w="120" w:type="dxa"/>
@@ -1271,6 +1274,7 @@
               <w:bottom w:val="single" w:sz="1" w:space="0" w:color="AAAAAA"/>
               <w:right w:val="single" w:sz="1" w:space="0" w:color="AAAAAA"/>
             </w:tcBorders>
+            <w:shd w:val="clear" w:color="auto" w:fill="70AD47" w:themeFill="accent6"/>
             <w:tcMar>
               <w:top w:w="80" w:type="dxa"/>
               <w:left w:w="120" w:type="dxa"/>
@@ -1291,12 +1295,6 @@
         </w:tc>
       </w:tr>
       <w:tr>
-        <w:tblPrEx>
-          <w:tblCellMar>
-            <w:top w:w="0" w:type="dxa"/>
-            <w:bottom w:w="0" w:type="dxa"/>
-          </w:tblCellMar>
-        </w:tblPrEx>
         <w:trPr>
           <w:trHeight w:val="627"/>
         </w:trPr>
@@ -1309,6 +1307,7 @@
               <w:bottom w:val="single" w:sz="1" w:space="0" w:color="AAAAAA"/>
               <w:right w:val="single" w:sz="1" w:space="0" w:color="AAAAAA"/>
             </w:tcBorders>
+            <w:shd w:val="clear" w:color="auto" w:fill="70AD47" w:themeFill="accent6"/>
             <w:tcMar>
               <w:top w:w="80" w:type="dxa"/>
               <w:left w:w="120" w:type="dxa"/>
@@ -1336,6 +1335,7 @@
               <w:bottom w:val="single" w:sz="1" w:space="0" w:color="AAAAAA"/>
               <w:right w:val="single" w:sz="1" w:space="0" w:color="AAAAAA"/>
             </w:tcBorders>
+            <w:shd w:val="clear" w:color="auto" w:fill="70AD47" w:themeFill="accent6"/>
             <w:tcMar>
               <w:top w:w="80" w:type="dxa"/>
               <w:left w:w="120" w:type="dxa"/>
@@ -1363,6 +1363,7 @@
               <w:bottom w:val="single" w:sz="1" w:space="0" w:color="AAAAAA"/>
               <w:right w:val="single" w:sz="1" w:space="0" w:color="AAAAAA"/>
             </w:tcBorders>
+            <w:shd w:val="clear" w:color="auto" w:fill="70AD47" w:themeFill="accent6"/>
             <w:tcMar>
               <w:top w:w="80" w:type="dxa"/>
               <w:left w:w="120" w:type="dxa"/>
@@ -1390,6 +1391,7 @@
               <w:bottom w:val="single" w:sz="1" w:space="0" w:color="AAAAAA"/>
               <w:right w:val="single" w:sz="1" w:space="0" w:color="AAAAAA"/>
             </w:tcBorders>
+            <w:shd w:val="clear" w:color="auto" w:fill="70AD47" w:themeFill="accent6"/>
             <w:tcMar>
               <w:top w:w="80" w:type="dxa"/>
               <w:left w:w="120" w:type="dxa"/>
@@ -1417,6 +1419,7 @@
               <w:bottom w:val="single" w:sz="1" w:space="0" w:color="AAAAAA"/>
               <w:right w:val="single" w:sz="1" w:space="0" w:color="AAAAAA"/>
             </w:tcBorders>
+            <w:shd w:val="clear" w:color="auto" w:fill="70AD47" w:themeFill="accent6"/>
             <w:tcMar>
               <w:top w:w="80" w:type="dxa"/>
               <w:left w:w="120" w:type="dxa"/>
@@ -1444,6 +1447,7 @@
               <w:bottom w:val="single" w:sz="1" w:space="0" w:color="AAAAAA"/>
               <w:right w:val="single" w:sz="1" w:space="0" w:color="AAAAAA"/>
             </w:tcBorders>
+            <w:shd w:val="clear" w:color="auto" w:fill="70AD47" w:themeFill="accent6"/>
             <w:tcMar>
               <w:top w:w="80" w:type="dxa"/>
               <w:left w:w="120" w:type="dxa"/>
@@ -1464,12 +1468,6 @@
         </w:tc>
       </w:tr>
       <w:tr>
-        <w:tblPrEx>
-          <w:tblCellMar>
-            <w:top w:w="0" w:type="dxa"/>
-            <w:bottom w:w="0" w:type="dxa"/>
-          </w:tblCellMar>
-        </w:tblPrEx>
         <w:trPr>
           <w:trHeight w:val="415"/>
         </w:trPr>
@@ -1482,6 +1480,7 @@
               <w:bottom w:val="single" w:sz="1" w:space="0" w:color="AAAAAA"/>
               <w:right w:val="single" w:sz="1" w:space="0" w:color="AAAAAA"/>
             </w:tcBorders>
+            <w:shd w:val="clear" w:color="auto" w:fill="70AD47" w:themeFill="accent6"/>
             <w:tcMar>
               <w:top w:w="80" w:type="dxa"/>
               <w:left w:w="120" w:type="dxa"/>
@@ -1509,6 +1508,7 @@
               <w:bottom w:val="single" w:sz="1" w:space="0" w:color="AAAAAA"/>
               <w:right w:val="single" w:sz="1" w:space="0" w:color="AAAAAA"/>
             </w:tcBorders>
+            <w:shd w:val="clear" w:color="auto" w:fill="70AD47" w:themeFill="accent6"/>
             <w:tcMar>
               <w:top w:w="80" w:type="dxa"/>
               <w:left w:w="120" w:type="dxa"/>
@@ -1536,6 +1536,7 @@
               <w:bottom w:val="single" w:sz="1" w:space="0" w:color="AAAAAA"/>
               <w:right w:val="single" w:sz="1" w:space="0" w:color="AAAAAA"/>
             </w:tcBorders>
+            <w:shd w:val="clear" w:color="auto" w:fill="70AD47" w:themeFill="accent6"/>
             <w:tcMar>
               <w:top w:w="80" w:type="dxa"/>
               <w:left w:w="120" w:type="dxa"/>
@@ -1563,6 +1564,7 @@
               <w:bottom w:val="single" w:sz="1" w:space="0" w:color="AAAAAA"/>
               <w:right w:val="single" w:sz="1" w:space="0" w:color="AAAAAA"/>
             </w:tcBorders>
+            <w:shd w:val="clear" w:color="auto" w:fill="70AD47" w:themeFill="accent6"/>
             <w:tcMar>
               <w:top w:w="80" w:type="dxa"/>
               <w:left w:w="120" w:type="dxa"/>
@@ -1590,6 +1592,7 @@
               <w:bottom w:val="single" w:sz="1" w:space="0" w:color="AAAAAA"/>
               <w:right w:val="single" w:sz="1" w:space="0" w:color="AAAAAA"/>
             </w:tcBorders>
+            <w:shd w:val="clear" w:color="auto" w:fill="70AD47" w:themeFill="accent6"/>
             <w:tcMar>
               <w:top w:w="80" w:type="dxa"/>
               <w:left w:w="120" w:type="dxa"/>
@@ -1617,6 +1620,7 @@
               <w:bottom w:val="single" w:sz="1" w:space="0" w:color="AAAAAA"/>
               <w:right w:val="single" w:sz="1" w:space="0" w:color="AAAAAA"/>
             </w:tcBorders>
+            <w:shd w:val="clear" w:color="auto" w:fill="70AD47" w:themeFill="accent6"/>
             <w:tcMar>
               <w:top w:w="80" w:type="dxa"/>
               <w:left w:w="120" w:type="dxa"/>
@@ -1677,12 +1681,6 @@
         <w:gridCol w:w="2314"/>
       </w:tblGrid>
       <w:tr>
-        <w:tblPrEx>
-          <w:tblCellMar>
-            <w:top w:w="0" w:type="dxa"/>
-            <w:bottom w:w="0" w:type="dxa"/>
-          </w:tblCellMar>
-        </w:tblPrEx>
         <w:trPr>
           <w:trHeight w:val="209"/>
           <w:tblHeader/>
@@ -1869,12 +1867,6 @@
         </w:tc>
       </w:tr>
       <w:tr>
-        <w:tblPrEx>
-          <w:tblCellMar>
-            <w:top w:w="0" w:type="dxa"/>
-            <w:bottom w:w="0" w:type="dxa"/>
-          </w:tblCellMar>
-        </w:tblPrEx>
         <w:trPr>
           <w:trHeight w:val="1944"/>
         </w:trPr>
@@ -2042,12 +2034,6 @@
         </w:tc>
       </w:tr>
       <w:tr>
-        <w:tblPrEx>
-          <w:tblCellMar>
-            <w:top w:w="0" w:type="dxa"/>
-            <w:bottom w:w="0" w:type="dxa"/>
-          </w:tblCellMar>
-        </w:tblPrEx>
         <w:trPr>
           <w:trHeight w:val="425"/>
         </w:trPr>
@@ -2215,12 +2201,6 @@
         </w:tc>
       </w:tr>
       <w:tr>
-        <w:tblPrEx>
-          <w:tblCellMar>
-            <w:top w:w="0" w:type="dxa"/>
-            <w:bottom w:w="0" w:type="dxa"/>
-          </w:tblCellMar>
-        </w:tblPrEx>
         <w:trPr>
           <w:trHeight w:val="859"/>
         </w:trPr>
@@ -2388,12 +2368,6 @@
         </w:tc>
       </w:tr>
       <w:tr>
-        <w:tblPrEx>
-          <w:tblCellMar>
-            <w:top w:w="0" w:type="dxa"/>
-            <w:bottom w:w="0" w:type="dxa"/>
-          </w:tblCellMar>
-        </w:tblPrEx>
         <w:trPr>
           <w:trHeight w:val="642"/>
         </w:trPr>
@@ -2562,12 +2536,6 @@
         </w:tc>
       </w:tr>
       <w:tr>
-        <w:tblPrEx>
-          <w:tblCellMar>
-            <w:top w:w="0" w:type="dxa"/>
-            <w:bottom w:w="0" w:type="dxa"/>
-          </w:tblCellMar>
-        </w:tblPrEx>
         <w:trPr>
           <w:trHeight w:val="1076"/>
         </w:trPr>
@@ -2729,7 +2697,25 @@
                 <w:sz w:val="19"/>
                 <w:szCs w:val="19"/>
               </w:rPr>
-              <w:t>Cập nhật deleted_at (soft-delete), ẩn khỏi danh sách hiển thị; User chỉ xóa được cuộc họp do mình host, Admin xóa được mọi cuộc họp</w:t>
+              <w:t>Cập nhật deleted_at (</w:t>
+            </w:r>
+            <w:proofErr w:type="gramStart"/>
+            <w:r>
+              <w:rPr>
+                <w:color w:val="000000"/>
+                <w:sz w:val="19"/>
+                <w:szCs w:val="19"/>
+              </w:rPr>
+              <w:t>soft-delete</w:t>
+            </w:r>
+            <w:proofErr w:type="gramEnd"/>
+            <w:r>
+              <w:rPr>
+                <w:color w:val="000000"/>
+                <w:sz w:val="19"/>
+                <w:szCs w:val="19"/>
+              </w:rPr>
+              <w:t>), ẩn khỏi danh sách hiển thị; User chỉ xóa được cuộc họp do mình host, Admin xóa được mọi cuộc họp</w:t>
             </w:r>
           </w:p>
         </w:tc>
@@ -2768,19 +2754,13 @@
       </w:tblPr>
       <w:tblGrid>
         <w:gridCol w:w="599"/>
-        <w:gridCol w:w="1389"/>
+        <w:gridCol w:w="1310"/>
         <w:gridCol w:w="2532"/>
-        <w:gridCol w:w="1831"/>
-        <w:gridCol w:w="1721"/>
-        <w:gridCol w:w="2240"/>
+        <w:gridCol w:w="1793"/>
+        <w:gridCol w:w="1640"/>
+        <w:gridCol w:w="2438"/>
       </w:tblGrid>
       <w:tr>
-        <w:tblPrEx>
-          <w:tblCellMar>
-            <w:top w:w="0" w:type="dxa"/>
-            <w:bottom w:w="0" w:type="dxa"/>
-          </w:tblCellMar>
-        </w:tblPrEx>
         <w:trPr>
           <w:trHeight w:val="219"/>
           <w:tblHeader/>
@@ -2967,12 +2947,6 @@
         </w:tc>
       </w:tr>
       <w:tr>
-        <w:tblPrEx>
-          <w:tblCellMar>
-            <w:top w:w="0" w:type="dxa"/>
-            <w:bottom w:w="0" w:type="dxa"/>
-          </w:tblCellMar>
-        </w:tblPrEx>
         <w:trPr>
           <w:trHeight w:val="900"/>
         </w:trPr>
@@ -3140,12 +3114,6 @@
         </w:tc>
       </w:tr>
       <w:tr>
-        <w:tblPrEx>
-          <w:tblCellMar>
-            <w:top w:w="0" w:type="dxa"/>
-            <w:bottom w:w="0" w:type="dxa"/>
-          </w:tblCellMar>
-        </w:tblPrEx>
         <w:trPr>
           <w:trHeight w:val="900"/>
         </w:trPr>
@@ -3313,12 +3281,6 @@
         </w:tc>
       </w:tr>
       <w:tr>
-        <w:tblPrEx>
-          <w:tblCellMar>
-            <w:top w:w="0" w:type="dxa"/>
-            <w:bottom w:w="0" w:type="dxa"/>
-          </w:tblCellMar>
-        </w:tblPrEx>
         <w:trPr>
           <w:trHeight w:val="673"/>
         </w:trPr>
@@ -3480,18 +3442,30 @@
                 <w:sz w:val="19"/>
                 <w:szCs w:val="19"/>
               </w:rPr>
-              <w:t>Hoàn tác soft-delete (xóa deleted_at), chỉ Admin được thực hiện</w:t>
+              <w:t xml:space="preserve">Hoàn tác </w:t>
+            </w:r>
+            <w:proofErr w:type="gramStart"/>
+            <w:r>
+              <w:rPr>
+                <w:color w:val="000000"/>
+                <w:sz w:val="19"/>
+                <w:szCs w:val="19"/>
+              </w:rPr>
+              <w:t>soft-delete</w:t>
+            </w:r>
+            <w:proofErr w:type="gramEnd"/>
+            <w:r>
+              <w:rPr>
+                <w:color w:val="000000"/>
+                <w:sz w:val="19"/>
+                <w:szCs w:val="19"/>
+              </w:rPr>
+              <w:t xml:space="preserve"> (xóa deleted_at), chỉ Admin được thực hiện</w:t>
             </w:r>
           </w:p>
         </w:tc>
       </w:tr>
       <w:tr>
-        <w:tblPrEx>
-          <w:tblCellMar>
-            <w:top w:w="0" w:type="dxa"/>
-            <w:bottom w:w="0" w:type="dxa"/>
-          </w:tblCellMar>
-        </w:tblPrEx>
         <w:trPr>
           <w:trHeight w:val="682"/>
         </w:trPr>
@@ -3692,19 +3666,13 @@
       </w:tblPr>
       <w:tblGrid>
         <w:gridCol w:w="599"/>
-        <w:gridCol w:w="1492"/>
-        <w:gridCol w:w="2173"/>
-        <w:gridCol w:w="1895"/>
-        <w:gridCol w:w="1853"/>
-        <w:gridCol w:w="2359"/>
+        <w:gridCol w:w="1297"/>
+        <w:gridCol w:w="2817"/>
+        <w:gridCol w:w="1791"/>
+        <w:gridCol w:w="1686"/>
+        <w:gridCol w:w="2181"/>
       </w:tblGrid>
       <w:tr>
-        <w:tblPrEx>
-          <w:tblCellMar>
-            <w:top w:w="0" w:type="dxa"/>
-            <w:bottom w:w="0" w:type="dxa"/>
-          </w:tblCellMar>
-        </w:tblPrEx>
         <w:trPr>
           <w:trHeight w:val="210"/>
           <w:tblHeader/>
@@ -3891,12 +3859,6 @@
         </w:tc>
       </w:tr>
       <w:tr>
-        <w:tblPrEx>
-          <w:tblCellMar>
-            <w:top w:w="0" w:type="dxa"/>
-            <w:bottom w:w="0" w:type="dxa"/>
-          </w:tblCellMar>
-        </w:tblPrEx>
         <w:trPr>
           <w:trHeight w:val="645"/>
         </w:trPr>
@@ -3909,6 +3871,7 @@
               <w:bottom w:val="single" w:sz="1" w:space="0" w:color="AAAAAA"/>
               <w:right w:val="single" w:sz="1" w:space="0" w:color="AAAAAA"/>
             </w:tcBorders>
+            <w:shd w:val="clear" w:color="auto" w:fill="70AD47" w:themeFill="accent6"/>
             <w:tcMar>
               <w:top w:w="80" w:type="dxa"/>
               <w:left w:w="120" w:type="dxa"/>
@@ -3936,6 +3899,7 @@
               <w:bottom w:val="single" w:sz="1" w:space="0" w:color="AAAAAA"/>
               <w:right w:val="single" w:sz="1" w:space="0" w:color="AAAAAA"/>
             </w:tcBorders>
+            <w:shd w:val="clear" w:color="auto" w:fill="70AD47" w:themeFill="accent6"/>
             <w:tcMar>
               <w:top w:w="80" w:type="dxa"/>
               <w:left w:w="120" w:type="dxa"/>
@@ -3963,6 +3927,7 @@
               <w:bottom w:val="single" w:sz="1" w:space="0" w:color="AAAAAA"/>
               <w:right w:val="single" w:sz="1" w:space="0" w:color="AAAAAA"/>
             </w:tcBorders>
+            <w:shd w:val="clear" w:color="auto" w:fill="70AD47" w:themeFill="accent6"/>
             <w:tcMar>
               <w:top w:w="80" w:type="dxa"/>
               <w:left w:w="120" w:type="dxa"/>
@@ -3990,6 +3955,7 @@
               <w:bottom w:val="single" w:sz="1" w:space="0" w:color="AAAAAA"/>
               <w:right w:val="single" w:sz="1" w:space="0" w:color="AAAAAA"/>
             </w:tcBorders>
+            <w:shd w:val="clear" w:color="auto" w:fill="70AD47" w:themeFill="accent6"/>
             <w:tcMar>
               <w:top w:w="80" w:type="dxa"/>
               <w:left w:w="120" w:type="dxa"/>
@@ -4017,6 +3983,7 @@
               <w:bottom w:val="single" w:sz="1" w:space="0" w:color="AAAAAA"/>
               <w:right w:val="single" w:sz="1" w:space="0" w:color="AAAAAA"/>
             </w:tcBorders>
+            <w:shd w:val="clear" w:color="auto" w:fill="70AD47" w:themeFill="accent6"/>
             <w:tcMar>
               <w:top w:w="80" w:type="dxa"/>
               <w:left w:w="120" w:type="dxa"/>
@@ -4044,6 +4011,7 @@
               <w:bottom w:val="single" w:sz="1" w:space="0" w:color="AAAAAA"/>
               <w:right w:val="single" w:sz="1" w:space="0" w:color="AAAAAA"/>
             </w:tcBorders>
+            <w:shd w:val="clear" w:color="auto" w:fill="70AD47" w:themeFill="accent6"/>
             <w:tcMar>
               <w:top w:w="80" w:type="dxa"/>
               <w:left w:w="120" w:type="dxa"/>
@@ -4064,12 +4032,6 @@
         </w:tc>
       </w:tr>
       <w:tr>
-        <w:tblPrEx>
-          <w:tblCellMar>
-            <w:top w:w="0" w:type="dxa"/>
-            <w:bottom w:w="0" w:type="dxa"/>
-          </w:tblCellMar>
-        </w:tblPrEx>
         <w:trPr>
           <w:trHeight w:val="427"/>
         </w:trPr>
@@ -4082,6 +4044,7 @@
               <w:bottom w:val="single" w:sz="1" w:space="0" w:color="AAAAAA"/>
               <w:right w:val="single" w:sz="1" w:space="0" w:color="AAAAAA"/>
             </w:tcBorders>
+            <w:shd w:val="clear" w:color="auto" w:fill="70AD47" w:themeFill="accent6"/>
             <w:tcMar>
               <w:top w:w="80" w:type="dxa"/>
               <w:left w:w="120" w:type="dxa"/>
@@ -4109,6 +4072,7 @@
               <w:bottom w:val="single" w:sz="1" w:space="0" w:color="AAAAAA"/>
               <w:right w:val="single" w:sz="1" w:space="0" w:color="AAAAAA"/>
             </w:tcBorders>
+            <w:shd w:val="clear" w:color="auto" w:fill="70AD47" w:themeFill="accent6"/>
             <w:tcMar>
               <w:top w:w="80" w:type="dxa"/>
               <w:left w:w="120" w:type="dxa"/>
@@ -4136,6 +4100,7 @@
               <w:bottom w:val="single" w:sz="1" w:space="0" w:color="AAAAAA"/>
               <w:right w:val="single" w:sz="1" w:space="0" w:color="AAAAAA"/>
             </w:tcBorders>
+            <w:shd w:val="clear" w:color="auto" w:fill="70AD47" w:themeFill="accent6"/>
             <w:tcMar>
               <w:top w:w="80" w:type="dxa"/>
               <w:left w:w="120" w:type="dxa"/>
@@ -4163,6 +4128,7 @@
               <w:bottom w:val="single" w:sz="1" w:space="0" w:color="AAAAAA"/>
               <w:right w:val="single" w:sz="1" w:space="0" w:color="AAAAAA"/>
             </w:tcBorders>
+            <w:shd w:val="clear" w:color="auto" w:fill="70AD47" w:themeFill="accent6"/>
             <w:tcMar>
               <w:top w:w="80" w:type="dxa"/>
               <w:left w:w="120" w:type="dxa"/>
@@ -4190,6 +4156,7 @@
               <w:bottom w:val="single" w:sz="1" w:space="0" w:color="AAAAAA"/>
               <w:right w:val="single" w:sz="1" w:space="0" w:color="AAAAAA"/>
             </w:tcBorders>
+            <w:shd w:val="clear" w:color="auto" w:fill="70AD47" w:themeFill="accent6"/>
             <w:tcMar>
               <w:top w:w="80" w:type="dxa"/>
               <w:left w:w="120" w:type="dxa"/>
@@ -4217,6 +4184,7 @@
               <w:bottom w:val="single" w:sz="1" w:space="0" w:color="AAAAAA"/>
               <w:right w:val="single" w:sz="1" w:space="0" w:color="AAAAAA"/>
             </w:tcBorders>
+            <w:shd w:val="clear" w:color="auto" w:fill="70AD47" w:themeFill="accent6"/>
             <w:tcMar>
               <w:top w:w="80" w:type="dxa"/>
               <w:left w:w="120" w:type="dxa"/>
@@ -4237,12 +4205,6 @@
         </w:tc>
       </w:tr>
       <w:tr>
-        <w:tblPrEx>
-          <w:tblCellMar>
-            <w:top w:w="0" w:type="dxa"/>
-            <w:bottom w:w="0" w:type="dxa"/>
-          </w:tblCellMar>
-        </w:tblPrEx>
         <w:trPr>
           <w:trHeight w:val="863"/>
         </w:trPr>
@@ -4255,6 +4217,7 @@
               <w:bottom w:val="single" w:sz="1" w:space="0" w:color="AAAAAA"/>
               <w:right w:val="single" w:sz="1" w:space="0" w:color="AAAAAA"/>
             </w:tcBorders>
+            <w:shd w:val="clear" w:color="auto" w:fill="70AD47" w:themeFill="accent6"/>
             <w:tcMar>
               <w:top w:w="80" w:type="dxa"/>
               <w:left w:w="120" w:type="dxa"/>
@@ -4282,6 +4245,7 @@
               <w:bottom w:val="single" w:sz="1" w:space="0" w:color="AAAAAA"/>
               <w:right w:val="single" w:sz="1" w:space="0" w:color="AAAAAA"/>
             </w:tcBorders>
+            <w:shd w:val="clear" w:color="auto" w:fill="70AD47" w:themeFill="accent6"/>
             <w:tcMar>
               <w:top w:w="80" w:type="dxa"/>
               <w:left w:w="120" w:type="dxa"/>
@@ -4309,6 +4273,7 @@
               <w:bottom w:val="single" w:sz="1" w:space="0" w:color="AAAAAA"/>
               <w:right w:val="single" w:sz="1" w:space="0" w:color="AAAAAA"/>
             </w:tcBorders>
+            <w:shd w:val="clear" w:color="auto" w:fill="70AD47" w:themeFill="accent6"/>
             <w:tcMar>
               <w:top w:w="80" w:type="dxa"/>
               <w:left w:w="120" w:type="dxa"/>
@@ -4336,6 +4301,7 @@
               <w:bottom w:val="single" w:sz="1" w:space="0" w:color="AAAAAA"/>
               <w:right w:val="single" w:sz="1" w:space="0" w:color="AAAAAA"/>
             </w:tcBorders>
+            <w:shd w:val="clear" w:color="auto" w:fill="70AD47" w:themeFill="accent6"/>
             <w:tcMar>
               <w:top w:w="80" w:type="dxa"/>
               <w:left w:w="120" w:type="dxa"/>
@@ -4363,6 +4329,7 @@
               <w:bottom w:val="single" w:sz="1" w:space="0" w:color="AAAAAA"/>
               <w:right w:val="single" w:sz="1" w:space="0" w:color="AAAAAA"/>
             </w:tcBorders>
+            <w:shd w:val="clear" w:color="auto" w:fill="70AD47" w:themeFill="accent6"/>
             <w:tcMar>
               <w:top w:w="80" w:type="dxa"/>
               <w:left w:w="120" w:type="dxa"/>
@@ -4390,6 +4357,7 @@
               <w:bottom w:val="single" w:sz="1" w:space="0" w:color="AAAAAA"/>
               <w:right w:val="single" w:sz="1" w:space="0" w:color="AAAAAA"/>
             </w:tcBorders>
+            <w:shd w:val="clear" w:color="auto" w:fill="70AD47" w:themeFill="accent6"/>
             <w:tcMar>
               <w:top w:w="80" w:type="dxa"/>
               <w:left w:w="120" w:type="dxa"/>
@@ -4410,12 +4378,6 @@
         </w:tc>
       </w:tr>
       <w:tr>
-        <w:tblPrEx>
-          <w:tblCellMar>
-            <w:top w:w="0" w:type="dxa"/>
-            <w:bottom w:w="0" w:type="dxa"/>
-          </w:tblCellMar>
-        </w:tblPrEx>
         <w:trPr>
           <w:trHeight w:val="645"/>
         </w:trPr>
@@ -4428,20 +4390,22 @@
               <w:bottom w:val="single" w:sz="1" w:space="0" w:color="AAAAAA"/>
               <w:right w:val="single" w:sz="1" w:space="0" w:color="AAAAAA"/>
             </w:tcBorders>
-            <w:tcMar>
-              <w:top w:w="80" w:type="dxa"/>
-              <w:left w:w="120" w:type="dxa"/>
-              <w:bottom w:w="80" w:type="dxa"/>
-              <w:right w:w="120" w:type="dxa"/>
-            </w:tcMar>
-          </w:tcPr>
-          <w:p>
-            <w:r>
-              <w:rPr>
-                <w:color w:val="000000"/>
-                <w:sz w:val="19"/>
-                <w:szCs w:val="19"/>
-              </w:rPr>
+            <w:shd w:val="clear" w:color="auto" w:fill="70AD47" w:themeFill="accent6"/>
+            <w:tcMar>
+              <w:top w:w="80" w:type="dxa"/>
+              <w:left w:w="120" w:type="dxa"/>
+              <w:bottom w:w="80" w:type="dxa"/>
+              <w:right w:w="120" w:type="dxa"/>
+            </w:tcMar>
+          </w:tcPr>
+          <w:p>
+            <w:r>
+              <w:rPr>
+                <w:color w:val="000000"/>
+                <w:sz w:val="19"/>
+                <w:szCs w:val="19"/>
+              </w:rPr>
+              <w:lastRenderedPageBreak/>
               <w:t>4</w:t>
             </w:r>
           </w:p>
@@ -4455,6 +4419,7 @@
               <w:bottom w:val="single" w:sz="1" w:space="0" w:color="AAAAAA"/>
               <w:right w:val="single" w:sz="1" w:space="0" w:color="AAAAAA"/>
             </w:tcBorders>
+            <w:shd w:val="clear" w:color="auto" w:fill="70AD47" w:themeFill="accent6"/>
             <w:tcMar>
               <w:top w:w="80" w:type="dxa"/>
               <w:left w:w="120" w:type="dxa"/>
@@ -4482,6 +4447,7 @@
               <w:bottom w:val="single" w:sz="1" w:space="0" w:color="AAAAAA"/>
               <w:right w:val="single" w:sz="1" w:space="0" w:color="AAAAAA"/>
             </w:tcBorders>
+            <w:shd w:val="clear" w:color="auto" w:fill="70AD47" w:themeFill="accent6"/>
             <w:tcMar>
               <w:top w:w="80" w:type="dxa"/>
               <w:left w:w="120" w:type="dxa"/>
@@ -4509,6 +4475,7 @@
               <w:bottom w:val="single" w:sz="1" w:space="0" w:color="AAAAAA"/>
               <w:right w:val="single" w:sz="1" w:space="0" w:color="AAAAAA"/>
             </w:tcBorders>
+            <w:shd w:val="clear" w:color="auto" w:fill="70AD47" w:themeFill="accent6"/>
             <w:tcMar>
               <w:top w:w="80" w:type="dxa"/>
               <w:left w:w="120" w:type="dxa"/>
@@ -4536,6 +4503,7 @@
               <w:bottom w:val="single" w:sz="1" w:space="0" w:color="AAAAAA"/>
               <w:right w:val="single" w:sz="1" w:space="0" w:color="AAAAAA"/>
             </w:tcBorders>
+            <w:shd w:val="clear" w:color="auto" w:fill="70AD47" w:themeFill="accent6"/>
             <w:tcMar>
               <w:top w:w="80" w:type="dxa"/>
               <w:left w:w="120" w:type="dxa"/>
@@ -4563,6 +4531,7 @@
               <w:bottom w:val="single" w:sz="1" w:space="0" w:color="AAAAAA"/>
               <w:right w:val="single" w:sz="1" w:space="0" w:color="AAAAAA"/>
             </w:tcBorders>
+            <w:shd w:val="clear" w:color="auto" w:fill="70AD47" w:themeFill="accent6"/>
             <w:tcMar>
               <w:top w:w="80" w:type="dxa"/>
               <w:left w:w="120" w:type="dxa"/>
@@ -4583,12 +4552,6 @@
         </w:tc>
       </w:tr>
       <w:tr>
-        <w:tblPrEx>
-          <w:tblCellMar>
-            <w:top w:w="0" w:type="dxa"/>
-            <w:bottom w:w="0" w:type="dxa"/>
-          </w:tblCellMar>
-        </w:tblPrEx>
         <w:trPr>
           <w:trHeight w:val="436"/>
         </w:trPr>
@@ -4601,6 +4564,7 @@
               <w:bottom w:val="single" w:sz="1" w:space="0" w:color="AAAAAA"/>
               <w:right w:val="single" w:sz="1" w:space="0" w:color="AAAAAA"/>
             </w:tcBorders>
+            <w:shd w:val="clear" w:color="auto" w:fill="70AD47" w:themeFill="accent6"/>
             <w:tcMar>
               <w:top w:w="80" w:type="dxa"/>
               <w:left w:w="120" w:type="dxa"/>
@@ -4628,6 +4592,7 @@
               <w:bottom w:val="single" w:sz="1" w:space="0" w:color="AAAAAA"/>
               <w:right w:val="single" w:sz="1" w:space="0" w:color="AAAAAA"/>
             </w:tcBorders>
+            <w:shd w:val="clear" w:color="auto" w:fill="70AD47" w:themeFill="accent6"/>
             <w:tcMar>
               <w:top w:w="80" w:type="dxa"/>
               <w:left w:w="120" w:type="dxa"/>
@@ -4655,6 +4620,7 @@
               <w:bottom w:val="single" w:sz="1" w:space="0" w:color="AAAAAA"/>
               <w:right w:val="single" w:sz="1" w:space="0" w:color="AAAAAA"/>
             </w:tcBorders>
+            <w:shd w:val="clear" w:color="auto" w:fill="70AD47" w:themeFill="accent6"/>
             <w:tcMar>
               <w:top w:w="80" w:type="dxa"/>
               <w:left w:w="120" w:type="dxa"/>
@@ -4682,6 +4648,7 @@
               <w:bottom w:val="single" w:sz="1" w:space="0" w:color="AAAAAA"/>
               <w:right w:val="single" w:sz="1" w:space="0" w:color="AAAAAA"/>
             </w:tcBorders>
+            <w:shd w:val="clear" w:color="auto" w:fill="70AD47" w:themeFill="accent6"/>
             <w:tcMar>
               <w:top w:w="80" w:type="dxa"/>
               <w:left w:w="120" w:type="dxa"/>
@@ -4709,6 +4676,7 @@
               <w:bottom w:val="single" w:sz="1" w:space="0" w:color="AAAAAA"/>
               <w:right w:val="single" w:sz="1" w:space="0" w:color="AAAAAA"/>
             </w:tcBorders>
+            <w:shd w:val="clear" w:color="auto" w:fill="70AD47" w:themeFill="accent6"/>
             <w:tcMar>
               <w:top w:w="80" w:type="dxa"/>
               <w:left w:w="120" w:type="dxa"/>
@@ -4736,6 +4704,7 @@
               <w:bottom w:val="single" w:sz="1" w:space="0" w:color="AAAAAA"/>
               <w:right w:val="single" w:sz="1" w:space="0" w:color="AAAAAA"/>
             </w:tcBorders>
+            <w:shd w:val="clear" w:color="auto" w:fill="70AD47" w:themeFill="accent6"/>
             <w:tcMar>
               <w:top w:w="80" w:type="dxa"/>
               <w:left w:w="120" w:type="dxa"/>
@@ -4756,12 +4725,6 @@
         </w:tc>
       </w:tr>
       <w:tr>
-        <w:tblPrEx>
-          <w:tblCellMar>
-            <w:top w:w="0" w:type="dxa"/>
-            <w:bottom w:w="0" w:type="dxa"/>
-          </w:tblCellMar>
-        </w:tblPrEx>
         <w:trPr>
           <w:trHeight w:val="645"/>
         </w:trPr>
@@ -4774,6 +4737,7 @@
               <w:bottom w:val="single" w:sz="1" w:space="0" w:color="AAAAAA"/>
               <w:right w:val="single" w:sz="1" w:space="0" w:color="AAAAAA"/>
             </w:tcBorders>
+            <w:shd w:val="clear" w:color="auto" w:fill="70AD47" w:themeFill="accent6"/>
             <w:tcMar>
               <w:top w:w="80" w:type="dxa"/>
               <w:left w:w="120" w:type="dxa"/>
@@ -4801,6 +4765,7 @@
               <w:bottom w:val="single" w:sz="1" w:space="0" w:color="AAAAAA"/>
               <w:right w:val="single" w:sz="1" w:space="0" w:color="AAAAAA"/>
             </w:tcBorders>
+            <w:shd w:val="clear" w:color="auto" w:fill="70AD47" w:themeFill="accent6"/>
             <w:tcMar>
               <w:top w:w="80" w:type="dxa"/>
               <w:left w:w="120" w:type="dxa"/>
@@ -4828,6 +4793,7 @@
               <w:bottom w:val="single" w:sz="1" w:space="0" w:color="AAAAAA"/>
               <w:right w:val="single" w:sz="1" w:space="0" w:color="AAAAAA"/>
             </w:tcBorders>
+            <w:shd w:val="clear" w:color="auto" w:fill="70AD47" w:themeFill="accent6"/>
             <w:tcMar>
               <w:top w:w="80" w:type="dxa"/>
               <w:left w:w="120" w:type="dxa"/>
@@ -4855,6 +4821,7 @@
               <w:bottom w:val="single" w:sz="1" w:space="0" w:color="AAAAAA"/>
               <w:right w:val="single" w:sz="1" w:space="0" w:color="AAAAAA"/>
             </w:tcBorders>
+            <w:shd w:val="clear" w:color="auto" w:fill="70AD47" w:themeFill="accent6"/>
             <w:tcMar>
               <w:top w:w="80" w:type="dxa"/>
               <w:left w:w="120" w:type="dxa"/>
@@ -4882,6 +4849,7 @@
               <w:bottom w:val="single" w:sz="1" w:space="0" w:color="AAAAAA"/>
               <w:right w:val="single" w:sz="1" w:space="0" w:color="AAAAAA"/>
             </w:tcBorders>
+            <w:shd w:val="clear" w:color="auto" w:fill="70AD47" w:themeFill="accent6"/>
             <w:tcMar>
               <w:top w:w="80" w:type="dxa"/>
               <w:left w:w="120" w:type="dxa"/>
@@ -4909,6 +4877,7 @@
               <w:bottom w:val="single" w:sz="1" w:space="0" w:color="AAAAAA"/>
               <w:right w:val="single" w:sz="1" w:space="0" w:color="AAAAAA"/>
             </w:tcBorders>
+            <w:shd w:val="clear" w:color="auto" w:fill="70AD47" w:themeFill="accent6"/>
             <w:tcMar>
               <w:top w:w="80" w:type="dxa"/>
               <w:left w:w="120" w:type="dxa"/>
@@ -4929,12 +4898,6 @@
         </w:tc>
       </w:tr>
       <w:tr>
-        <w:tblPrEx>
-          <w:tblCellMar>
-            <w:top w:w="0" w:type="dxa"/>
-            <w:bottom w:w="0" w:type="dxa"/>
-          </w:tblCellMar>
-        </w:tblPrEx>
         <w:trPr>
           <w:trHeight w:val="427"/>
         </w:trPr>
@@ -4947,21 +4910,21 @@
               <w:bottom w:val="single" w:sz="1" w:space="0" w:color="AAAAAA"/>
               <w:right w:val="single" w:sz="1" w:space="0" w:color="AAAAAA"/>
             </w:tcBorders>
-            <w:tcMar>
-              <w:top w:w="80" w:type="dxa"/>
-              <w:left w:w="120" w:type="dxa"/>
-              <w:bottom w:w="80" w:type="dxa"/>
-              <w:right w:w="120" w:type="dxa"/>
-            </w:tcMar>
-          </w:tcPr>
-          <w:p>
-            <w:r>
-              <w:rPr>
-                <w:color w:val="000000"/>
-                <w:sz w:val="19"/>
-                <w:szCs w:val="19"/>
-              </w:rPr>
-              <w:lastRenderedPageBreak/>
+            <w:shd w:val="clear" w:color="auto" w:fill="70AD47" w:themeFill="accent6"/>
+            <w:tcMar>
+              <w:top w:w="80" w:type="dxa"/>
+              <w:left w:w="120" w:type="dxa"/>
+              <w:bottom w:w="80" w:type="dxa"/>
+              <w:right w:w="120" w:type="dxa"/>
+            </w:tcMar>
+          </w:tcPr>
+          <w:p>
+            <w:r>
+              <w:rPr>
+                <w:color w:val="000000"/>
+                <w:sz w:val="19"/>
+                <w:szCs w:val="19"/>
+              </w:rPr>
               <w:t>7</w:t>
             </w:r>
           </w:p>
@@ -4975,6 +4938,7 @@
               <w:bottom w:val="single" w:sz="1" w:space="0" w:color="AAAAAA"/>
               <w:right w:val="single" w:sz="1" w:space="0" w:color="AAAAAA"/>
             </w:tcBorders>
+            <w:shd w:val="clear" w:color="auto" w:fill="70AD47" w:themeFill="accent6"/>
             <w:tcMar>
               <w:top w:w="80" w:type="dxa"/>
               <w:left w:w="120" w:type="dxa"/>
@@ -5002,6 +4966,7 @@
               <w:bottom w:val="single" w:sz="1" w:space="0" w:color="AAAAAA"/>
               <w:right w:val="single" w:sz="1" w:space="0" w:color="AAAAAA"/>
             </w:tcBorders>
+            <w:shd w:val="clear" w:color="auto" w:fill="70AD47" w:themeFill="accent6"/>
             <w:tcMar>
               <w:top w:w="80" w:type="dxa"/>
               <w:left w:w="120" w:type="dxa"/>
@@ -5029,6 +4994,7 @@
               <w:bottom w:val="single" w:sz="1" w:space="0" w:color="AAAAAA"/>
               <w:right w:val="single" w:sz="1" w:space="0" w:color="AAAAAA"/>
             </w:tcBorders>
+            <w:shd w:val="clear" w:color="auto" w:fill="70AD47" w:themeFill="accent6"/>
             <w:tcMar>
               <w:top w:w="80" w:type="dxa"/>
               <w:left w:w="120" w:type="dxa"/>
@@ -5056,6 +5022,7 @@
               <w:bottom w:val="single" w:sz="1" w:space="0" w:color="AAAAAA"/>
               <w:right w:val="single" w:sz="1" w:space="0" w:color="AAAAAA"/>
             </w:tcBorders>
+            <w:shd w:val="clear" w:color="auto" w:fill="70AD47" w:themeFill="accent6"/>
             <w:tcMar>
               <w:top w:w="80" w:type="dxa"/>
               <w:left w:w="120" w:type="dxa"/>
@@ -5083,6 +5050,7 @@
               <w:bottom w:val="single" w:sz="1" w:space="0" w:color="AAAAAA"/>
               <w:right w:val="single" w:sz="1" w:space="0" w:color="AAAAAA"/>
             </w:tcBorders>
+            <w:shd w:val="clear" w:color="auto" w:fill="70AD47" w:themeFill="accent6"/>
             <w:tcMar>
               <w:top w:w="80" w:type="dxa"/>
               <w:left w:w="120" w:type="dxa"/>
@@ -5103,12 +5071,6 @@
         </w:tc>
       </w:tr>
       <w:tr>
-        <w:tblPrEx>
-          <w:tblCellMar>
-            <w:top w:w="0" w:type="dxa"/>
-            <w:bottom w:w="0" w:type="dxa"/>
-          </w:tblCellMar>
-        </w:tblPrEx>
         <w:trPr>
           <w:trHeight w:val="645"/>
         </w:trPr>
@@ -5121,6 +5083,7 @@
               <w:bottom w:val="single" w:sz="1" w:space="0" w:color="AAAAAA"/>
               <w:right w:val="single" w:sz="1" w:space="0" w:color="AAAAAA"/>
             </w:tcBorders>
+            <w:shd w:val="clear" w:color="auto" w:fill="70AD47" w:themeFill="accent6"/>
             <w:tcMar>
               <w:top w:w="80" w:type="dxa"/>
               <w:left w:w="120" w:type="dxa"/>
@@ -5148,6 +5111,7 @@
               <w:bottom w:val="single" w:sz="1" w:space="0" w:color="AAAAAA"/>
               <w:right w:val="single" w:sz="1" w:space="0" w:color="AAAAAA"/>
             </w:tcBorders>
+            <w:shd w:val="clear" w:color="auto" w:fill="70AD47" w:themeFill="accent6"/>
             <w:tcMar>
               <w:top w:w="80" w:type="dxa"/>
               <w:left w:w="120" w:type="dxa"/>
@@ -5175,6 +5139,7 @@
               <w:bottom w:val="single" w:sz="1" w:space="0" w:color="AAAAAA"/>
               <w:right w:val="single" w:sz="1" w:space="0" w:color="AAAAAA"/>
             </w:tcBorders>
+            <w:shd w:val="clear" w:color="auto" w:fill="70AD47" w:themeFill="accent6"/>
             <w:tcMar>
               <w:top w:w="80" w:type="dxa"/>
               <w:left w:w="120" w:type="dxa"/>
@@ -5202,6 +5167,7 @@
               <w:bottom w:val="single" w:sz="1" w:space="0" w:color="AAAAAA"/>
               <w:right w:val="single" w:sz="1" w:space="0" w:color="AAAAAA"/>
             </w:tcBorders>
+            <w:shd w:val="clear" w:color="auto" w:fill="70AD47" w:themeFill="accent6"/>
             <w:tcMar>
               <w:top w:w="80" w:type="dxa"/>
               <w:left w:w="120" w:type="dxa"/>
@@ -5229,6 +5195,7 @@
               <w:bottom w:val="single" w:sz="1" w:space="0" w:color="AAAAAA"/>
               <w:right w:val="single" w:sz="1" w:space="0" w:color="AAAAAA"/>
             </w:tcBorders>
+            <w:shd w:val="clear" w:color="auto" w:fill="70AD47" w:themeFill="accent6"/>
             <w:tcMar>
               <w:top w:w="80" w:type="dxa"/>
               <w:left w:w="120" w:type="dxa"/>
@@ -5256,6 +5223,7 @@
               <w:bottom w:val="single" w:sz="1" w:space="0" w:color="AAAAAA"/>
               <w:right w:val="single" w:sz="1" w:space="0" w:color="AAAAAA"/>
             </w:tcBorders>
+            <w:shd w:val="clear" w:color="auto" w:fill="70AD47" w:themeFill="accent6"/>
             <w:tcMar>
               <w:top w:w="80" w:type="dxa"/>
               <w:left w:w="120" w:type="dxa"/>
@@ -5276,12 +5244,6 @@
         </w:tc>
       </w:tr>
       <w:tr>
-        <w:tblPrEx>
-          <w:tblCellMar>
-            <w:top w:w="0" w:type="dxa"/>
-            <w:bottom w:w="0" w:type="dxa"/>
-          </w:tblCellMar>
-        </w:tblPrEx>
         <w:trPr>
           <w:trHeight w:val="654"/>
         </w:trPr>
@@ -5294,6 +5256,7 @@
               <w:bottom w:val="single" w:sz="1" w:space="0" w:color="AAAAAA"/>
               <w:right w:val="single" w:sz="1" w:space="0" w:color="AAAAAA"/>
             </w:tcBorders>
+            <w:shd w:val="clear" w:color="auto" w:fill="70AD47" w:themeFill="accent6"/>
             <w:tcMar>
               <w:top w:w="80" w:type="dxa"/>
               <w:left w:w="120" w:type="dxa"/>
@@ -5321,6 +5284,7 @@
               <w:bottom w:val="single" w:sz="1" w:space="0" w:color="AAAAAA"/>
               <w:right w:val="single" w:sz="1" w:space="0" w:color="AAAAAA"/>
             </w:tcBorders>
+            <w:shd w:val="clear" w:color="auto" w:fill="70AD47" w:themeFill="accent6"/>
             <w:tcMar>
               <w:top w:w="80" w:type="dxa"/>
               <w:left w:w="120" w:type="dxa"/>
@@ -5348,6 +5312,7 @@
               <w:bottom w:val="single" w:sz="1" w:space="0" w:color="AAAAAA"/>
               <w:right w:val="single" w:sz="1" w:space="0" w:color="AAAAAA"/>
             </w:tcBorders>
+            <w:shd w:val="clear" w:color="auto" w:fill="70AD47" w:themeFill="accent6"/>
             <w:tcMar>
               <w:top w:w="80" w:type="dxa"/>
               <w:left w:w="120" w:type="dxa"/>
@@ -5375,6 +5340,7 @@
               <w:bottom w:val="single" w:sz="1" w:space="0" w:color="AAAAAA"/>
               <w:right w:val="single" w:sz="1" w:space="0" w:color="AAAAAA"/>
             </w:tcBorders>
+            <w:shd w:val="clear" w:color="auto" w:fill="70AD47" w:themeFill="accent6"/>
             <w:tcMar>
               <w:top w:w="80" w:type="dxa"/>
               <w:left w:w="120" w:type="dxa"/>
@@ -5402,6 +5368,7 @@
               <w:bottom w:val="single" w:sz="1" w:space="0" w:color="AAAAAA"/>
               <w:right w:val="single" w:sz="1" w:space="0" w:color="AAAAAA"/>
             </w:tcBorders>
+            <w:shd w:val="clear" w:color="auto" w:fill="70AD47" w:themeFill="accent6"/>
             <w:tcMar>
               <w:top w:w="80" w:type="dxa"/>
               <w:left w:w="120" w:type="dxa"/>
@@ -5429,32 +5396,37 @@
               <w:bottom w:val="single" w:sz="1" w:space="0" w:color="AAAAAA"/>
               <w:right w:val="single" w:sz="1" w:space="0" w:color="AAAAAA"/>
             </w:tcBorders>
-            <w:tcMar>
-              <w:top w:w="80" w:type="dxa"/>
-              <w:left w:w="120" w:type="dxa"/>
-              <w:bottom w:w="80" w:type="dxa"/>
-              <w:right w:w="120" w:type="dxa"/>
-            </w:tcMar>
-          </w:tcPr>
-          <w:p>
-            <w:r>
-              <w:rPr>
-                <w:color w:val="000000"/>
-                <w:sz w:val="19"/>
-                <w:szCs w:val="19"/>
-              </w:rPr>
-              <w:t>Soft-delete; chỉ cho phép khi không còn User nào thuộc phòng ban</w:t>
+            <w:shd w:val="clear" w:color="auto" w:fill="70AD47" w:themeFill="accent6"/>
+            <w:tcMar>
+              <w:top w:w="80" w:type="dxa"/>
+              <w:left w:w="120" w:type="dxa"/>
+              <w:bottom w:w="80" w:type="dxa"/>
+              <w:right w:w="120" w:type="dxa"/>
+            </w:tcMar>
+          </w:tcPr>
+          <w:p>
+            <w:proofErr w:type="gramStart"/>
+            <w:r>
+              <w:rPr>
+                <w:color w:val="000000"/>
+                <w:sz w:val="19"/>
+                <w:szCs w:val="19"/>
+              </w:rPr>
+              <w:t>Soft-delete</w:t>
+            </w:r>
+            <w:proofErr w:type="gramEnd"/>
+            <w:r>
+              <w:rPr>
+                <w:color w:val="000000"/>
+                <w:sz w:val="19"/>
+                <w:szCs w:val="19"/>
+              </w:rPr>
+              <w:t>; chỉ cho phép khi không còn User nào thuộc phòng ban</w:t>
             </w:r>
           </w:p>
         </w:tc>
       </w:tr>
       <w:tr>
-        <w:tblPrEx>
-          <w:tblCellMar>
-            <w:top w:w="0" w:type="dxa"/>
-            <w:bottom w:w="0" w:type="dxa"/>
-          </w:tblCellMar>
-        </w:tblPrEx>
         <w:trPr>
           <w:trHeight w:val="654"/>
         </w:trPr>
@@ -5467,6 +5439,7 @@
               <w:bottom w:val="single" w:sz="1" w:space="0" w:color="AAAAAA"/>
               <w:right w:val="single" w:sz="1" w:space="0" w:color="AAAAAA"/>
             </w:tcBorders>
+            <w:shd w:val="clear" w:color="auto" w:fill="70AD47" w:themeFill="accent6"/>
             <w:tcMar>
               <w:top w:w="80" w:type="dxa"/>
               <w:left w:w="120" w:type="dxa"/>
@@ -5494,6 +5467,7 @@
               <w:bottom w:val="single" w:sz="1" w:space="0" w:color="AAAAAA"/>
               <w:right w:val="single" w:sz="1" w:space="0" w:color="AAAAAA"/>
             </w:tcBorders>
+            <w:shd w:val="clear" w:color="auto" w:fill="70AD47" w:themeFill="accent6"/>
             <w:tcMar>
               <w:top w:w="80" w:type="dxa"/>
               <w:left w:w="120" w:type="dxa"/>
@@ -5521,6 +5495,7 @@
               <w:bottom w:val="single" w:sz="1" w:space="0" w:color="AAAAAA"/>
               <w:right w:val="single" w:sz="1" w:space="0" w:color="AAAAAA"/>
             </w:tcBorders>
+            <w:shd w:val="clear" w:color="auto" w:fill="70AD47" w:themeFill="accent6"/>
             <w:tcMar>
               <w:top w:w="80" w:type="dxa"/>
               <w:left w:w="120" w:type="dxa"/>
@@ -5548,6 +5523,7 @@
               <w:bottom w:val="single" w:sz="1" w:space="0" w:color="AAAAAA"/>
               <w:right w:val="single" w:sz="1" w:space="0" w:color="AAAAAA"/>
             </w:tcBorders>
+            <w:shd w:val="clear" w:color="auto" w:fill="70AD47" w:themeFill="accent6"/>
             <w:tcMar>
               <w:top w:w="80" w:type="dxa"/>
               <w:left w:w="120" w:type="dxa"/>
@@ -5575,6 +5551,7 @@
               <w:bottom w:val="single" w:sz="1" w:space="0" w:color="AAAAAA"/>
               <w:right w:val="single" w:sz="1" w:space="0" w:color="AAAAAA"/>
             </w:tcBorders>
+            <w:shd w:val="clear" w:color="auto" w:fill="70AD47" w:themeFill="accent6"/>
             <w:tcMar>
               <w:top w:w="80" w:type="dxa"/>
               <w:left w:w="120" w:type="dxa"/>
@@ -5602,21 +5579,40 @@
               <w:bottom w:val="single" w:sz="1" w:space="0" w:color="AAAAAA"/>
               <w:right w:val="single" w:sz="1" w:space="0" w:color="AAAAAA"/>
             </w:tcBorders>
-            <w:tcMar>
-              <w:top w:w="80" w:type="dxa"/>
-              <w:left w:w="120" w:type="dxa"/>
-              <w:bottom w:w="80" w:type="dxa"/>
-              <w:right w:w="120" w:type="dxa"/>
-            </w:tcMar>
-          </w:tcPr>
-          <w:p>
-            <w:r>
-              <w:rPr>
-                <w:color w:val="000000"/>
-                <w:sz w:val="19"/>
-                <w:szCs w:val="19"/>
-              </w:rPr>
-              <w:t>Hoàn tác soft-delete; chỉ Admin được thực hiện, chỉ hiển thị nút Khôi phục với phòng ban đang ở trạng thái đã xóa</w:t>
+            <w:shd w:val="clear" w:color="auto" w:fill="70AD47" w:themeFill="accent6"/>
+            <w:tcMar>
+              <w:top w:w="80" w:type="dxa"/>
+              <w:left w:w="120" w:type="dxa"/>
+              <w:bottom w:w="80" w:type="dxa"/>
+              <w:right w:w="120" w:type="dxa"/>
+            </w:tcMar>
+          </w:tcPr>
+          <w:p>
+            <w:r>
+              <w:rPr>
+                <w:color w:val="000000"/>
+                <w:sz w:val="19"/>
+                <w:szCs w:val="19"/>
+              </w:rPr>
+              <w:t xml:space="preserve">Hoàn tác </w:t>
+            </w:r>
+            <w:proofErr w:type="gramStart"/>
+            <w:r>
+              <w:rPr>
+                <w:color w:val="000000"/>
+                <w:sz w:val="19"/>
+                <w:szCs w:val="19"/>
+              </w:rPr>
+              <w:t>soft-delete</w:t>
+            </w:r>
+            <w:proofErr w:type="gramEnd"/>
+            <w:r>
+              <w:rPr>
+                <w:color w:val="000000"/>
+                <w:sz w:val="19"/>
+                <w:szCs w:val="19"/>
+              </w:rPr>
+              <w:t>; chỉ Admin được thực hiện, chỉ hiển thị nút Khôi phục với phòng ban đang ở trạng thái đã xóa</w:t>
             </w:r>
           </w:p>
         </w:tc>
@@ -5677,12 +5673,6 @@
         <w:gridCol w:w="2205"/>
       </w:tblGrid>
       <w:tr>
-        <w:tblPrEx>
-          <w:tblCellMar>
-            <w:top w:w="0" w:type="dxa"/>
-            <w:bottom w:w="0" w:type="dxa"/>
-          </w:tblCellMar>
-        </w:tblPrEx>
         <w:trPr>
           <w:trHeight w:val="208"/>
           <w:tblHeader/>
@@ -5869,12 +5859,6 @@
         </w:tc>
       </w:tr>
       <w:tr>
-        <w:tblPrEx>
-          <w:tblCellMar>
-            <w:top w:w="0" w:type="dxa"/>
-            <w:bottom w:w="0" w:type="dxa"/>
-          </w:tblCellMar>
-        </w:tblPrEx>
         <w:trPr>
           <w:trHeight w:val="640"/>
         </w:trPr>
@@ -6042,12 +6026,6 @@
         </w:tc>
       </w:tr>
       <w:tr>
-        <w:tblPrEx>
-          <w:tblCellMar>
-            <w:top w:w="0" w:type="dxa"/>
-            <w:bottom w:w="0" w:type="dxa"/>
-          </w:tblCellMar>
-        </w:tblPrEx>
         <w:trPr>
           <w:trHeight w:val="640"/>
         </w:trPr>
@@ -6215,12 +6193,6 @@
         </w:tc>
       </w:tr>
       <w:tr>
-        <w:tblPrEx>
-          <w:tblCellMar>
-            <w:top w:w="0" w:type="dxa"/>
-            <w:bottom w:w="0" w:type="dxa"/>
-          </w:tblCellMar>
-        </w:tblPrEx>
         <w:trPr>
           <w:trHeight w:val="640"/>
         </w:trPr>
@@ -6388,12 +6360,6 @@
         </w:tc>
       </w:tr>
       <w:tr>
-        <w:tblPrEx>
-          <w:tblCellMar>
-            <w:top w:w="0" w:type="dxa"/>
-            <w:bottom w:w="0" w:type="dxa"/>
-          </w:tblCellMar>
-        </w:tblPrEx>
         <w:trPr>
           <w:trHeight w:val="640"/>
         </w:trPr>
@@ -6561,12 +6527,6 @@
         </w:tc>
       </w:tr>
       <w:tr>
-        <w:tblPrEx>
-          <w:tblCellMar>
-            <w:top w:w="0" w:type="dxa"/>
-            <w:bottom w:w="0" w:type="dxa"/>
-          </w:tblCellMar>
-        </w:tblPrEx>
         <w:trPr>
           <w:trHeight w:val="649"/>
         </w:trPr>
@@ -6775,12 +6735,6 @@
         <w:gridCol w:w="2150"/>
       </w:tblGrid>
       <w:tr>
-        <w:tblPrEx>
-          <w:tblCellMar>
-            <w:top w:w="0" w:type="dxa"/>
-            <w:bottom w:w="0" w:type="dxa"/>
-          </w:tblCellMar>
-        </w:tblPrEx>
         <w:trPr>
           <w:trHeight w:val="209"/>
           <w:tblHeader/>
@@ -6811,6 +6765,7 @@
                 <w:sz w:val="19"/>
                 <w:szCs w:val="19"/>
               </w:rPr>
+              <w:lastRenderedPageBreak/>
               <w:t>STT</w:t>
             </w:r>
           </w:p>
@@ -6967,12 +6922,6 @@
         </w:tc>
       </w:tr>
       <w:tr>
-        <w:tblPrEx>
-          <w:tblCellMar>
-            <w:top w:w="0" w:type="dxa"/>
-            <w:bottom w:w="0" w:type="dxa"/>
-          </w:tblCellMar>
-        </w:tblPrEx>
         <w:trPr>
           <w:trHeight w:val="425"/>
         </w:trPr>
@@ -7140,12 +7089,6 @@
         </w:tc>
       </w:tr>
       <w:tr>
-        <w:tblPrEx>
-          <w:tblCellMar>
-            <w:top w:w="0" w:type="dxa"/>
-            <w:bottom w:w="0" w:type="dxa"/>
-          </w:tblCellMar>
-        </w:tblPrEx>
         <w:trPr>
           <w:trHeight w:val="860"/>
         </w:trPr>
@@ -7313,12 +7256,6 @@
         </w:tc>
       </w:tr>
       <w:tr>
-        <w:tblPrEx>
-          <w:tblCellMar>
-            <w:top w:w="0" w:type="dxa"/>
-            <w:bottom w:w="0" w:type="dxa"/>
-          </w:tblCellMar>
-        </w:tblPrEx>
         <w:trPr>
           <w:trHeight w:val="643"/>
         </w:trPr>
@@ -7486,12 +7423,6 @@
         </w:tc>
       </w:tr>
       <w:tr>
-        <w:tblPrEx>
-          <w:tblCellMar>
-            <w:top w:w="0" w:type="dxa"/>
-            <w:bottom w:w="0" w:type="dxa"/>
-          </w:tblCellMar>
-        </w:tblPrEx>
         <w:trPr>
           <w:trHeight w:val="643"/>
         </w:trPr>
@@ -7659,12 +7590,6 @@
         </w:tc>
       </w:tr>
       <w:tr>
-        <w:tblPrEx>
-          <w:tblCellMar>
-            <w:top w:w="0" w:type="dxa"/>
-            <w:bottom w:w="0" w:type="dxa"/>
-          </w:tblCellMar>
-        </w:tblPrEx>
         <w:trPr>
           <w:trHeight w:val="652"/>
         </w:trPr>
@@ -7691,7 +7616,6 @@
                 <w:sz w:val="19"/>
                 <w:szCs w:val="19"/>
               </w:rPr>
-              <w:lastRenderedPageBreak/>
               <w:t>5</w:t>
             </w:r>
           </w:p>
@@ -7833,12 +7757,6 @@
         </w:tc>
       </w:tr>
       <w:tr>
-        <w:tblPrEx>
-          <w:tblCellMar>
-            <w:top w:w="0" w:type="dxa"/>
-            <w:bottom w:w="0" w:type="dxa"/>
-          </w:tblCellMar>
-        </w:tblPrEx>
         <w:trPr>
           <w:trHeight w:val="643"/>
         </w:trPr>
@@ -8006,12 +7924,6 @@
         </w:tc>
       </w:tr>
       <w:tr>
-        <w:tblPrEx>
-          <w:tblCellMar>
-            <w:top w:w="0" w:type="dxa"/>
-            <w:bottom w:w="0" w:type="dxa"/>
-          </w:tblCellMar>
-        </w:tblPrEx>
         <w:trPr>
           <w:trHeight w:val="425"/>
         </w:trPr>
@@ -8119,7 +8031,16 @@
                 <w:sz w:val="19"/>
                 <w:szCs w:val="19"/>
               </w:rPr>
-              <w:t>title, description, audio_file (multipart), department_id (chỉ áp dụng nếu role = Admin; nếu role = User, Backend tự ép department_id = department của chính User)</w:t>
+              <w:t xml:space="preserve">title, description, audio_file (multipart), department_id (chỉ áp </w:t>
+            </w:r>
+            <w:r>
+              <w:rPr>
+                <w:color w:val="000000"/>
+                <w:sz w:val="19"/>
+                <w:szCs w:val="19"/>
+              </w:rPr>
+              <w:lastRenderedPageBreak/>
+              <w:t>dụng nếu role = Admin; nếu role = User, Backend tự ép department_id = department của chính User)</w:t>
             </w:r>
           </w:p>
         </w:tc>
@@ -8146,6 +8067,7 @@
                 <w:sz w:val="19"/>
                 <w:szCs w:val="19"/>
               </w:rPr>
+              <w:lastRenderedPageBreak/>
               <w:t>Meeting (status = PROCESSING)</w:t>
             </w:r>
           </w:p>
@@ -8179,12 +8101,6 @@
         </w:tc>
       </w:tr>
       <w:tr>
-        <w:tblPrEx>
-          <w:tblCellMar>
-            <w:top w:w="0" w:type="dxa"/>
-            <w:bottom w:w="0" w:type="dxa"/>
-          </w:tblCellMar>
-        </w:tblPrEx>
         <w:trPr>
           <w:trHeight w:val="1730"/>
         </w:trPr>
@@ -8392,12 +8308,6 @@
         <w:gridCol w:w="2278"/>
       </w:tblGrid>
       <w:tr>
-        <w:tblPrEx>
-          <w:tblCellMar>
-            <w:top w:w="0" w:type="dxa"/>
-            <w:bottom w:w="0" w:type="dxa"/>
-          </w:tblCellMar>
-        </w:tblPrEx>
         <w:trPr>
           <w:trHeight w:val="208"/>
           <w:tblHeader/>
@@ -8584,12 +8494,6 @@
         </w:tc>
       </w:tr>
       <w:tr>
-        <w:tblPrEx>
-          <w:tblCellMar>
-            <w:top w:w="0" w:type="dxa"/>
-            <w:bottom w:w="0" w:type="dxa"/>
-          </w:tblCellMar>
-        </w:tblPrEx>
         <w:trPr>
           <w:trHeight w:val="1506"/>
         </w:trPr>
@@ -8757,12 +8661,6 @@
         </w:tc>
       </w:tr>
       <w:tr>
-        <w:tblPrEx>
-          <w:tblCellMar>
-            <w:top w:w="0" w:type="dxa"/>
-            <w:bottom w:w="0" w:type="dxa"/>
-          </w:tblCellMar>
-        </w:tblPrEx>
         <w:trPr>
           <w:trHeight w:val="640"/>
         </w:trPr>
@@ -8930,12 +8828,6 @@
         </w:tc>
       </w:tr>
       <w:tr>
-        <w:tblPrEx>
-          <w:tblCellMar>
-            <w:top w:w="0" w:type="dxa"/>
-            <w:bottom w:w="0" w:type="dxa"/>
-          </w:tblCellMar>
-        </w:tblPrEx>
         <w:trPr>
           <w:trHeight w:val="640"/>
         </w:trPr>

</xml_diff>